<commit_message>
Rebuild résumé to mirror the landing page and add a Spanish version
Regenerated the downloadable .docx from the same copy as the site (About,
all 3 Experience roles and bullets, 8 Skills, Software list, Education,
Languages, contact info) so the CV and the landing page never drift out
of sync, and added a matching Spanish translation (Luis_Bravo_CV_ES.docx).

The "Download résumé" button now points at whichever file matches the
page's current language and updates live when the language toggle is
used, so an EN visitor gets the EN CV and an ES visitor gets the ES one.

Co-Authored-By: Claude Sonnet 5 <noreply@anthropic.com>
Claude-Session: https://claude.ai/code/session_01Ph6Y7CgqVMbQPSXWemVriR
</commit_message>
<xml_diff>
--- a/assets/Luis_Bravo_CV_EN.docx
+++ b/assets/Luis_Bravo_CV_EN.docx
@@ -8,9 +8,10 @@
       </w:pPr>
       <w:r>
         <w:rPr>
-          <w:b/>
-          <w:bCs/>
-          <w:color w:val="1E2420"/>
+          <w:rFonts w:ascii="Arial" w:cs="Arial" w:eastAsia="Arial" w:hAnsi="Arial"/>
+          <w:b/>
+          <w:bCs/>
+          <w:color w:val="141516"/>
           <w:sz w:val="44"/>
           <w:szCs w:val="44"/>
         </w:rPr>
@@ -19,104 +20,119 @@
     </w:p>
     <w:p>
       <w:pPr>
-        <w:spacing w:after="100"/>
-      </w:pPr>
-      <w:r>
-        <w:rPr>
-          <w:b/>
-          <w:bCs/>
-          <w:color w:val="2B6E76"/>
-          <w:sz w:val="24"/>
-          <w:szCs w:val="24"/>
-        </w:rPr>
-        <w:t xml:space="preserve">Senior Video Editor  |  Motion Graphics  |  AI-Driven Content Production</w:t>
-      </w:r>
-    </w:p>
-    <w:p>
-      <w:pPr>
-        <w:spacing w:after="200"/>
-      </w:pPr>
-      <w:r>
-        <w:rPr>
-          <w:color w:val="4B564F"/>
+        <w:spacing w:after="120"/>
+      </w:pPr>
+      <w:r>
+        <w:rPr>
+          <w:rFonts w:ascii="Arial" w:cs="Arial" w:eastAsia="Arial" w:hAnsi="Arial"/>
+          <w:color w:val="1F6F6B"/>
+          <w:sz w:val="21"/>
+          <w:szCs w:val="21"/>
+        </w:rPr>
+        <w:t xml:space="preserve">Senior Video Editor · Motion Graphics · AI-Driven Production</w:t>
+      </w:r>
+    </w:p>
+    <w:p>
+      <w:pPr>
+        <w:pBdr>
+          <w:bottom w:val="single" w:color="CCCCCC" w:sz="4" w:space="6"/>
+        </w:pBdr>
+        <w:spacing w:after="160"/>
+      </w:pPr>
+      <w:r>
+        <w:rPr>
+          <w:rFonts w:ascii="Arial" w:cs="Arial" w:eastAsia="Arial" w:hAnsi="Arial"/>
+          <w:color w:val="5B6667"/>
+          <w:sz w:val="18"/>
+          <w:szCs w:val="18"/>
+        </w:rPr>
+        <w:t xml:space="preserve">saintclovis101@gmail.com   ·   +57 305 222 3353   ·   Colombia — open to remote, international</w:t>
+      </w:r>
+    </w:p>
+    <w:p>
+      <w:pPr>
+        <w:pBdr>
+          <w:bottom w:val="single" w:color="1F6F6B" w:sz="6" w:space="4"/>
+        </w:pBdr>
+        <w:spacing w:after="100" w:before="260"/>
+      </w:pPr>
+      <w:r>
+        <w:rPr>
+          <w:rFonts w:ascii="Arial" w:cs="Arial" w:eastAsia="Arial" w:hAnsi="Arial"/>
+          <w:b/>
+          <w:bCs/>
+          <w:color w:val="1F6F6B"/>
+          <w:spacing w:val="20"/>
+          <w:sz w:val="20"/>
+          <w:szCs w:val="20"/>
+        </w:rPr>
+        <w:t xml:space="preserve">SUMMARY</w:t>
+      </w:r>
+    </w:p>
+    <w:p>
+      <w:pPr>
+        <w:spacing w:after="80"/>
+      </w:pPr>
+      <w:r>
+        <w:rPr>
+          <w:rFonts w:ascii="Arial" w:cs="Arial" w:eastAsia="Arial" w:hAnsi="Arial"/>
+          <w:color w:val="141516"/>
+          <w:sz w:val="20"/>
+          <w:szCs w:val="20"/>
+        </w:rPr>
+        <w:t xml:space="preserve">I combine hands-on editing — Premiere Pro, After Effects, DaVinci Resolve — with production leadership: directing live shoots, running streaming broadcasts, and more recently, building generative-AI workflows into a studio's creative pipeline. I care about turnaround time as much as craft; the work has to look right and ship on schedule.</w:t>
+      </w:r>
+    </w:p>
+    <w:p>
+      <w:pPr>
+        <w:pBdr>
+          <w:bottom w:val="single" w:color="1F6F6B" w:sz="6" w:space="4"/>
+        </w:pBdr>
+        <w:spacing w:after="100" w:before="260"/>
+      </w:pPr>
+      <w:r>
+        <w:rPr>
+          <w:rFonts w:ascii="Arial" w:cs="Arial" w:eastAsia="Arial" w:hAnsi="Arial"/>
+          <w:b/>
+          <w:bCs/>
+          <w:color w:val="1F6F6B"/>
+          <w:spacing w:val="20"/>
+          <w:sz w:val="20"/>
+          <w:szCs w:val="20"/>
+        </w:rPr>
+        <w:t xml:space="preserve">EXPERIENCE</w:t>
+      </w:r>
+    </w:p>
+    <w:p>
+      <w:pPr>
+        <w:spacing w:after="10" w:before="40"/>
+      </w:pPr>
+      <w:r>
+        <w:rPr>
+          <w:rFonts w:ascii="Arial" w:cs="Arial" w:eastAsia="Arial" w:hAnsi="Arial"/>
+          <w:b/>
+          <w:bCs/>
+          <w:color w:val="141516"/>
+          <w:sz w:val="21"/>
+          <w:szCs w:val="21"/>
+        </w:rPr>
+        <w:t xml:space="preserve">AI Production &amp; Creative Development Lead</w:t>
+      </w:r>
+    </w:p>
+    <w:p>
+      <w:pPr>
+        <w:spacing w:after="70"/>
+      </w:pPr>
+      <w:r>
+        <w:rPr>
+          <w:rFonts w:ascii="Arial" w:cs="Arial" w:eastAsia="Arial" w:hAnsi="Arial"/>
+          <w:i/>
+          <w:iCs/>
+          <w:color w:val="5B6667"/>
           <w:sz w:val="19"/>
           <w:szCs w:val="19"/>
         </w:rPr>
-        <w:t xml:space="preserve">Colombia — Open to Remote (International)   •   +57 305 222 3353   •   saintclovis101@gmail.com   •   @clvs____</w:t>
-      </w:r>
-    </w:p>
-    <w:p>
-      <w:pPr>
-        <w:pBdr>
-          <w:bottom w:val="single" w:color="2B6E76" w:sz="6" w:space="4"/>
-        </w:pBdr>
-        <w:spacing w:after="120" w:before="260"/>
-      </w:pPr>
-      <w:r>
-        <w:rPr>
-          <w:b/>
-          <w:bCs/>
-          <w:color w:val="2B6E76"/>
-          <w:spacing w:val="12"/>
-          <w:sz w:val="21"/>
-          <w:szCs w:val="21"/>
-        </w:rPr>
-        <w:t xml:space="preserve">SUMMARY</w:t>
-      </w:r>
-    </w:p>
-    <w:p>
-      <w:pPr>
-        <w:spacing w:after="80"/>
-      </w:pPr>
-      <w:r>
-        <w:rPr>
-          <w:color w:val="1E2420"/>
-          <w:sz w:val="21"/>
-          <w:szCs w:val="21"/>
-        </w:rPr>
-        <w:t xml:space="preserve">Senior video editor and audiovisual producer with a track record leading brand campaigns end-to-end — from live production through post-production and motion graphics — and pioneering AI-driven creative workflows for a production studio. Combines hands-on editing (Premiere Pro, After Effects, DaVinci Resolve) with production leadership, live-streaming direction, and the rollout of AI tools that sped up delivery for creative teams.</w:t>
-      </w:r>
-    </w:p>
-    <w:p>
-      <w:pPr>
-        <w:pBdr>
-          <w:bottom w:val="single" w:color="2B6E76" w:sz="6" w:space="4"/>
-        </w:pBdr>
-        <w:spacing w:after="120" w:before="260"/>
-      </w:pPr>
-      <w:r>
-        <w:rPr>
-          <w:b/>
-          <w:bCs/>
-          <w:color w:val="2B6E76"/>
-          <w:spacing w:val="12"/>
-          <w:sz w:val="21"/>
-          <w:szCs w:val="21"/>
-        </w:rPr>
-        <w:t xml:space="preserve">EXPERIENCE</w:t>
-      </w:r>
-    </w:p>
-    <w:p>
-      <w:pPr>
-        <w:spacing w:after="10" w:before="160"/>
-      </w:pPr>
-      <w:r>
-        <w:rPr>
-          <w:b/>
-          <w:bCs/>
-          <w:color w:val="1E2420"/>
-          <w:sz w:val="23"/>
-          <w:szCs w:val="23"/>
-        </w:rPr>
-        <w:t xml:space="preserve">AI Production &amp; Creative Development Lead</w:t>
-      </w:r>
-      <w:r>
-        <w:rPr>
-          <w:color w:val="1E2420"/>
-          <w:sz w:val="23"/>
-          <w:szCs w:val="23"/>
-        </w:rPr>
-        <w:t xml:space="preserve">  —  Metaskins Studios</w:t>
+        <w:t xml:space="preserve">Metaskins Studios</w:t>
       </w:r>
     </w:p>
     <w:p>
@@ -130,11 +146,12 @@
       </w:pPr>
       <w:r>
         <w:rPr>
-          <w:color w:val="1E2420"/>
-          <w:sz w:val="21"/>
-          <w:szCs w:val="21"/>
-        </w:rPr>
-        <w:t xml:space="preserve">Led the studio's transition to AI-integrated creative workflows for image and video production.</w:t>
+          <w:rFonts w:ascii="Arial" w:cs="Arial" w:eastAsia="Arial" w:hAnsi="Arial"/>
+          <w:color w:val="141516"/>
+          <w:sz w:val="20"/>
+          <w:szCs w:val="20"/>
+        </w:rPr>
+        <w:t xml:space="preserve">Led the studio's transition to AI-integrated workflows for image and video production.</w:t>
       </w:r>
     </w:p>
     <w:p>
@@ -148,9 +165,10 @@
       </w:pPr>
       <w:r>
         <w:rPr>
-          <w:color w:val="1E2420"/>
-          <w:sz w:val="21"/>
-          <w:szCs w:val="21"/>
+          <w:rFonts w:ascii="Arial" w:cs="Arial" w:eastAsia="Arial" w:hAnsi="Arial"/>
+          <w:color w:val="141516"/>
+          <w:sz w:val="20"/>
+          <w:szCs w:val="20"/>
         </w:rPr>
         <w:t xml:space="preserve">Directed advertising campaign production for brands including Agua Bendita and Stanley, plus tennis and commercial content.</w:t>
       </w:r>
@@ -166,11 +184,12 @@
       </w:pPr>
       <w:r>
         <w:rPr>
-          <w:color w:val="1E2420"/>
-          <w:sz w:val="21"/>
-          <w:szCs w:val="21"/>
-        </w:rPr>
-        <w:t xml:space="preserve">Trained and directed a creative team on generative AI tools for content production.</w:t>
+          <w:rFonts w:ascii="Arial" w:cs="Arial" w:eastAsia="Arial" w:hAnsi="Arial"/>
+          <w:color w:val="141516"/>
+          <w:sz w:val="20"/>
+          <w:szCs w:val="20"/>
+        </w:rPr>
+        <w:t xml:space="preserve">Trained and directed the creative team on generative AI tools for content production.</w:t>
       </w:r>
     </w:p>
     <w:p>
@@ -184,34 +203,44 @@
       </w:pPr>
       <w:r>
         <w:rPr>
-          <w:color w:val="1E2420"/>
+          <w:rFonts w:ascii="Arial" w:cs="Arial" w:eastAsia="Arial" w:hAnsi="Arial"/>
+          <w:color w:val="141516"/>
+          <w:sz w:val="20"/>
+          <w:szCs w:val="20"/>
+        </w:rPr>
+        <w:t xml:space="preserve">Built and optimized live-streaming and audiovisual production pipelines end-to-end.</w:t>
+      </w:r>
+    </w:p>
+    <w:p>
+      <w:pPr>
+        <w:spacing w:after="10" w:before="160"/>
+      </w:pPr>
+      <w:r>
+        <w:rPr>
+          <w:rFonts w:ascii="Arial" w:cs="Arial" w:eastAsia="Arial" w:hAnsi="Arial"/>
+          <w:b/>
+          <w:bCs/>
+          <w:color w:val="141516"/>
           <w:sz w:val="21"/>
           <w:szCs w:val="21"/>
         </w:rPr>
-        <w:t xml:space="preserve">Built and optimized live-streaming and audiovisual production pipelines end-to-end.</w:t>
-      </w:r>
-    </w:p>
-    <w:p>
-      <w:pPr>
-        <w:spacing w:after="10" w:before="160"/>
-      </w:pPr>
-      <w:r>
-        <w:rPr>
-          <w:b/>
-          <w:bCs/>
-          <w:color w:val="1E2420"/>
-          <w:sz w:val="23"/>
-          <w:szCs w:val="23"/>
-        </w:rPr>
         <w:t xml:space="preserve">Camera Operator / Director of Photography / Livestream / Lighting</w:t>
       </w:r>
-      <w:r>
-        <w:rPr>
-          <w:color w:val="1E2420"/>
-          <w:sz w:val="23"/>
-          <w:szCs w:val="23"/>
-        </w:rPr>
-        <w:t xml:space="preserve">  —  Independent Audiovisual Productions</w:t>
+    </w:p>
+    <w:p>
+      <w:pPr>
+        <w:spacing w:after="70"/>
+      </w:pPr>
+      <w:r>
+        <w:rPr>
+          <w:rFonts w:ascii="Arial" w:cs="Arial" w:eastAsia="Arial" w:hAnsi="Arial"/>
+          <w:i/>
+          <w:iCs/>
+          <w:color w:val="5B6667"/>
+          <w:sz w:val="19"/>
+          <w:szCs w:val="19"/>
+        </w:rPr>
+        <w:t xml:space="preserve">Independent Audiovisual Productions</w:t>
       </w:r>
     </w:p>
     <w:p>
@@ -225,9 +254,10 @@
       </w:pPr>
       <w:r>
         <w:rPr>
-          <w:color w:val="1E2420"/>
-          <w:sz w:val="21"/>
-          <w:szCs w:val="21"/>
+          <w:rFonts w:ascii="Arial" w:cs="Arial" w:eastAsia="Arial" w:hAnsi="Arial"/>
+          <w:color w:val="141516"/>
+          <w:sz w:val="20"/>
+          <w:szCs w:val="20"/>
         </w:rPr>
         <w:t xml:space="preserve">Operated camera and directed photography and lighting for large-scale audiovisual productions.</w:t>
       </w:r>
@@ -243,9 +273,10 @@
       </w:pPr>
       <w:r>
         <w:rPr>
-          <w:color w:val="1E2420"/>
-          <w:sz w:val="21"/>
-          <w:szCs w:val="21"/>
+          <w:rFonts w:ascii="Arial" w:cs="Arial" w:eastAsia="Arial" w:hAnsi="Arial"/>
+          <w:color w:val="141516"/>
+          <w:sz w:val="20"/>
+          <w:szCs w:val="20"/>
         </w:rPr>
         <w:t xml:space="preserve">Produced and technically directed live-streaming broadcasts.</w:t>
       </w:r>
@@ -261,34 +292,44 @@
       </w:pPr>
       <w:r>
         <w:rPr>
-          <w:color w:val="1E2420"/>
+          <w:rFonts w:ascii="Arial" w:cs="Arial" w:eastAsia="Arial" w:hAnsi="Arial"/>
+          <w:color w:val="141516"/>
+          <w:sz w:val="20"/>
+          <w:szCs w:val="20"/>
+        </w:rPr>
+        <w:t xml:space="preserve">Led field production and technical-creative development for independent projects.</w:t>
+      </w:r>
+    </w:p>
+    <w:p>
+      <w:pPr>
+        <w:spacing w:after="10" w:before="160"/>
+      </w:pPr>
+      <w:r>
+        <w:rPr>
+          <w:rFonts w:ascii="Arial" w:cs="Arial" w:eastAsia="Arial" w:hAnsi="Arial"/>
+          <w:b/>
+          <w:bCs/>
+          <w:color w:val="141516"/>
           <w:sz w:val="21"/>
           <w:szCs w:val="21"/>
         </w:rPr>
-        <w:t xml:space="preserve">Led field production and technical-creative development for independent projects.</w:t>
-      </w:r>
-    </w:p>
-    <w:p>
-      <w:pPr>
-        <w:spacing w:after="10" w:before="160"/>
-      </w:pPr>
-      <w:r>
-        <w:rPr>
-          <w:b/>
-          <w:bCs/>
-          <w:color w:val="1E2420"/>
-          <w:sz w:val="23"/>
-          <w:szCs w:val="23"/>
-        </w:rPr>
         <w:t xml:space="preserve">Video Editing &amp; Multimedia Production Lead</w:t>
       </w:r>
-      <w:r>
-        <w:rPr>
-          <w:color w:val="1E2420"/>
-          <w:sz w:val="23"/>
-          <w:szCs w:val="23"/>
-        </w:rPr>
-        <w:t xml:space="preserve">  —  Metaskins Studios</w:t>
+    </w:p>
+    <w:p>
+      <w:pPr>
+        <w:spacing w:after="70"/>
+      </w:pPr>
+      <w:r>
+        <w:rPr>
+          <w:rFonts w:ascii="Arial" w:cs="Arial" w:eastAsia="Arial" w:hAnsi="Arial"/>
+          <w:i/>
+          <w:iCs/>
+          <w:color w:val="5B6667"/>
+          <w:sz w:val="19"/>
+          <w:szCs w:val="19"/>
+        </w:rPr>
+        <w:t xml:space="preserve">Metaskins Studios</w:t>
       </w:r>
     </w:p>
     <w:p>
@@ -302,9 +343,10 @@
       </w:pPr>
       <w:r>
         <w:rPr>
-          <w:color w:val="1E2420"/>
-          <w:sz w:val="21"/>
-          <w:szCs w:val="21"/>
+          <w:rFonts w:ascii="Arial" w:cs="Arial" w:eastAsia="Arial" w:hAnsi="Arial"/>
+          <w:color w:val="141516"/>
+          <w:sz w:val="20"/>
+          <w:szCs w:val="20"/>
         </w:rPr>
         <w:t xml:space="preserve">Led editing, post-production, and motion graphics for advertising campaigns for recognized brands.</w:t>
       </w:r>
@@ -320,9 +362,10 @@
       </w:pPr>
       <w:r>
         <w:rPr>
-          <w:color w:val="1E2420"/>
-          <w:sz w:val="21"/>
-          <w:szCs w:val="21"/>
+          <w:rFonts w:ascii="Arial" w:cs="Arial" w:eastAsia="Arial" w:hAnsi="Arial"/>
+          <w:color w:val="141516"/>
+          <w:sz w:val="20"/>
+          <w:szCs w:val="20"/>
         </w:rPr>
         <w:t xml:space="preserve">Created graphic assets and illustrations for brand campaigns.</w:t>
       </w:r>
@@ -338,30 +381,166 @@
       </w:pPr>
       <w:r>
         <w:rPr>
-          <w:color w:val="1E2420"/>
+          <w:rFonts w:ascii="Arial" w:cs="Arial" w:eastAsia="Arial" w:hAnsi="Arial"/>
+          <w:color w:val="141516"/>
+          <w:sz w:val="20"/>
+          <w:szCs w:val="20"/>
+        </w:rPr>
+        <w:t xml:space="preserve">Produced and supervised multimedia content; organized production schedules and team workflows.</w:t>
+      </w:r>
+    </w:p>
+    <w:p>
+      <w:pPr>
+        <w:pBdr>
+          <w:bottom w:val="single" w:color="1F6F6B" w:sz="6" w:space="4"/>
+        </w:pBdr>
+        <w:spacing w:after="100" w:before="260"/>
+      </w:pPr>
+      <w:r>
+        <w:rPr>
+          <w:rFonts w:ascii="Arial" w:cs="Arial" w:eastAsia="Arial" w:hAnsi="Arial"/>
+          <w:b/>
+          <w:bCs/>
+          <w:color w:val="1F6F6B"/>
+          <w:spacing w:val="20"/>
+          <w:sz w:val="20"/>
+          <w:szCs w:val="20"/>
+        </w:rPr>
+        <w:t xml:space="preserve">SKILLS</w:t>
+      </w:r>
+    </w:p>
+    <w:p>
+      <w:pPr>
+        <w:spacing w:after="80"/>
+      </w:pPr>
+      <w:r>
+        <w:rPr>
+          <w:rFonts w:ascii="Arial" w:cs="Arial" w:eastAsia="Arial" w:hAnsi="Arial"/>
+          <w:color w:val="141516"/>
+          <w:sz w:val="20"/>
+          <w:szCs w:val="20"/>
+        </w:rPr>
+        <w:t xml:space="preserve">Video Editing   ·   Motion Graphics   ·   Audiovisual Production   ·   Livestreaming   ·   Photography &amp; Lighting   ·   AI Creative Workflows   ·   Creative Direction   ·   Team Leadership</w:t>
+      </w:r>
+    </w:p>
+    <w:p>
+      <w:pPr>
+        <w:pBdr>
+          <w:bottom w:val="single" w:color="1F6F6B" w:sz="6" w:space="4"/>
+        </w:pBdr>
+        <w:spacing w:after="100" w:before="260"/>
+      </w:pPr>
+      <w:r>
+        <w:rPr>
+          <w:rFonts w:ascii="Arial" w:cs="Arial" w:eastAsia="Arial" w:hAnsi="Arial"/>
+          <w:b/>
+          <w:bCs/>
+          <w:color w:val="1F6F6B"/>
+          <w:spacing w:val="20"/>
+          <w:sz w:val="20"/>
+          <w:szCs w:val="20"/>
+        </w:rPr>
+        <w:t xml:space="preserve">SOFTWARE &amp; TOOLS</w:t>
+      </w:r>
+    </w:p>
+    <w:p>
+      <w:pPr>
+        <w:spacing w:after="80"/>
+      </w:pPr>
+      <w:r>
+        <w:rPr>
+          <w:rFonts w:ascii="Arial" w:cs="Arial" w:eastAsia="Arial" w:hAnsi="Arial"/>
+          <w:color w:val="141516"/>
+          <w:sz w:val="20"/>
+          <w:szCs w:val="20"/>
+        </w:rPr>
+        <w:t xml:space="preserve">Adobe After Effects   ·   Adobe Premiere Pro   ·   Adobe Illustrator   ·   DaVinci Resolve   ·   OBS Studio   ·   Generative AI tools (image &amp; video)</w:t>
+      </w:r>
+    </w:p>
+    <w:p>
+      <w:pPr>
+        <w:pBdr>
+          <w:bottom w:val="single" w:color="1F6F6B" w:sz="6" w:space="4"/>
+        </w:pBdr>
+        <w:spacing w:after="100" w:before="260"/>
+      </w:pPr>
+      <w:r>
+        <w:rPr>
+          <w:rFonts w:ascii="Arial" w:cs="Arial" w:eastAsia="Arial" w:hAnsi="Arial"/>
+          <w:b/>
+          <w:bCs/>
+          <w:color w:val="1F6F6B"/>
+          <w:spacing w:val="20"/>
+          <w:sz w:val="20"/>
+          <w:szCs w:val="20"/>
+        </w:rPr>
+        <w:t xml:space="preserve">EDUCATION</w:t>
+      </w:r>
+    </w:p>
+    <w:p>
+      <w:pPr>
+        <w:spacing w:after="10"/>
+      </w:pPr>
+      <w:r>
+        <w:rPr>
+          <w:rFonts w:ascii="Arial" w:cs="Arial" w:eastAsia="Arial" w:hAnsi="Arial"/>
+          <w:b/>
+          <w:bCs/>
+          <w:color w:val="141516"/>
           <w:sz w:val="21"/>
           <w:szCs w:val="21"/>
         </w:rPr>
-        <w:t xml:space="preserve">Produced and supervised multimedia content; organized production schedules and team workflows.</w:t>
+        <w:t xml:space="preserve">Interactive Design</w:t>
+      </w:r>
+    </w:p>
+    <w:p>
+      <w:pPr>
+        <w:spacing w:after="10"/>
+      </w:pPr>
+      <w:r>
+        <w:rPr>
+          <w:rFonts w:ascii="Arial" w:cs="Arial" w:eastAsia="Arial" w:hAnsi="Arial"/>
+          <w:i/>
+          <w:iCs/>
+          <w:color w:val="5B6667"/>
+          <w:sz w:val="19"/>
+          <w:szCs w:val="19"/>
+        </w:rPr>
+        <w:t xml:space="preserve">Fundación Universitaria Bellas Artes (FUBA), Medellín, Colombia</w:t>
+      </w:r>
+    </w:p>
+    <w:p>
+      <w:pPr>
+        <w:spacing w:after="80"/>
+      </w:pPr>
+      <w:r>
+        <w:rPr>
+          <w:rFonts w:ascii="Arial" w:cs="Arial" w:eastAsia="Arial" w:hAnsi="Arial"/>
+          <w:color w:val="141516"/>
+          <w:sz w:val="20"/>
+          <w:szCs w:val="20"/>
+        </w:rPr>
+        <w:t xml:space="preserve">Coursework in interactive design and digital media.</w:t>
       </w:r>
     </w:p>
     <w:p>
       <w:pPr>
         <w:pBdr>
-          <w:bottom w:val="single" w:color="2B6E76" w:sz="6" w:space="4"/>
+          <w:bottom w:val="single" w:color="1F6F6B" w:sz="6" w:space="4"/>
         </w:pBdr>
-        <w:spacing w:after="120" w:before="260"/>
-      </w:pPr>
-      <w:r>
-        <w:rPr>
-          <w:b/>
-          <w:bCs/>
-          <w:color w:val="2B6E76"/>
-          <w:spacing w:val="12"/>
-          <w:sz w:val="21"/>
-          <w:szCs w:val="21"/>
-        </w:rPr>
-        <w:t xml:space="preserve">SKILLS</w:t>
+        <w:spacing w:after="100" w:before="260"/>
+      </w:pPr>
+      <w:r>
+        <w:rPr>
+          <w:rFonts w:ascii="Arial" w:cs="Arial" w:eastAsia="Arial" w:hAnsi="Arial"/>
+          <w:b/>
+          <w:bCs/>
+          <w:color w:val="1F6F6B"/>
+          <w:spacing w:val="20"/>
+          <w:sz w:val="20"/>
+          <w:szCs w:val="20"/>
+        </w:rPr>
+        <w:t xml:space="preserve">LANGUAGES</w:t>
       </w:r>
     </w:p>
     <w:p>
@@ -370,124 +549,17 @@
       </w:pPr>
       <w:r>
         <w:rPr>
-          <w:color w:val="1E2420"/>
-          <w:sz w:val="21"/>
-          <w:szCs w:val="21"/>
-        </w:rPr>
-        <w:t xml:space="preserve">Video Editing &amp; Post-Production  •  Motion Graphics  •  Audiovisual Production  •  Livestreaming &amp; Technical Direction  •  Photography Direction &amp; Lighting  •  AI-Driven Creative Workflows  •  Creative Direction  •  Team Leadership &amp; Training</w:t>
-      </w:r>
-    </w:p>
-    <w:p>
-      <w:pPr>
-        <w:pBdr>
-          <w:bottom w:val="single" w:color="2B6E76" w:sz="6" w:space="4"/>
-        </w:pBdr>
-        <w:spacing w:after="120" w:before="260"/>
-      </w:pPr>
-      <w:r>
-        <w:rPr>
-          <w:b/>
-          <w:bCs/>
-          <w:color w:val="2B6E76"/>
-          <w:spacing w:val="12"/>
-          <w:sz w:val="21"/>
-          <w:szCs w:val="21"/>
-        </w:rPr>
-        <w:t xml:space="preserve">SOFTWARE &amp; TOOLS</w:t>
-      </w:r>
-    </w:p>
-    <w:p>
-      <w:pPr>
-        <w:spacing w:after="80"/>
-      </w:pPr>
-      <w:r>
-        <w:rPr>
-          <w:color w:val="1E2420"/>
-          <w:sz w:val="21"/>
-          <w:szCs w:val="21"/>
-        </w:rPr>
-        <w:t xml:space="preserve">Adobe After Effects  •  Adobe Premiere Pro  •  Adobe Illustrator  •  DaVinci Resolve  •  OBS Studio  •  Generative AI tools (image &amp; video)</w:t>
-      </w:r>
-    </w:p>
-    <w:p>
-      <w:pPr>
-        <w:pBdr>
-          <w:bottom w:val="single" w:color="2B6E76" w:sz="6" w:space="4"/>
-        </w:pBdr>
-        <w:spacing w:after="120" w:before="260"/>
-      </w:pPr>
-      <w:r>
-        <w:rPr>
-          <w:b/>
-          <w:bCs/>
-          <w:color w:val="2B6E76"/>
-          <w:spacing w:val="12"/>
-          <w:sz w:val="21"/>
-          <w:szCs w:val="21"/>
-        </w:rPr>
-        <w:t xml:space="preserve">EDUCATION</w:t>
-      </w:r>
-    </w:p>
-    <w:p>
-      <w:pPr>
-        <w:spacing w:after="10"/>
-      </w:pPr>
-      <w:r>
-        <w:rPr>
-          <w:b/>
-          <w:bCs/>
-          <w:color w:val="1E2420"/>
-          <w:sz w:val="21"/>
-          <w:szCs w:val="21"/>
-        </w:rPr>
-        <w:t xml:space="preserve">Interactive Design — Fundación Universitaria Bellas Artes (FUBA), Medellín, Colombia</w:t>
-      </w:r>
-    </w:p>
-    <w:p>
-      <w:pPr>
-        <w:spacing w:after="80"/>
-      </w:pPr>
-      <w:r>
-        <w:rPr>
-          <w:color w:val="4B564F"/>
-          <w:sz w:val="20"/>
-          <w:szCs w:val="20"/>
-        </w:rPr>
-        <w:t xml:space="preserve">Coursework in interactive design and digital media</w:t>
-      </w:r>
-    </w:p>
-    <w:p>
-      <w:pPr>
-        <w:pBdr>
-          <w:bottom w:val="single" w:color="2B6E76" w:sz="6" w:space="4"/>
-        </w:pBdr>
-        <w:spacing w:after="120" w:before="260"/>
-      </w:pPr>
-      <w:r>
-        <w:rPr>
-          <w:b/>
-          <w:bCs/>
-          <w:color w:val="2B6E76"/>
-          <w:spacing w:val="12"/>
-          <w:sz w:val="21"/>
-          <w:szCs w:val="21"/>
-        </w:rPr>
-        <w:t xml:space="preserve">LANGUAGES</w:t>
-      </w:r>
-    </w:p>
-    <w:p>
-      <w:r>
-        <w:rPr>
-          <w:color w:val="1E2420"/>
-          <w:sz w:val="21"/>
-          <w:szCs w:val="21"/>
-        </w:rPr>
-        <w:t xml:space="preserve">Spanish — Native   •   English — Advanced</w:t>
+          <w:rFonts w:ascii="Arial" w:cs="Arial" w:eastAsia="Arial" w:hAnsi="Arial"/>
+          <w:color w:val="141516"/>
+          <w:sz w:val="20"/>
+          <w:szCs w:val="20"/>
+        </w:rPr>
+        <w:t xml:space="preserve">Spanish — Native   ·   English — Advanced</w:t>
       </w:r>
     </w:p>
     <w:sectPr>
       <w:pgSz w:w="12240" w:h="15840" w:orient="portrait"/>
-      <w:pgMar w:top="720" w:right="900" w:bottom="720" w:left="900" w:header="708" w:footer="708" w:gutter="0"/>
+      <w:pgMar w:top="900" w:right="1000" w:bottom="900" w:left="1000" w:header="708" w:footer="708" w:gutter="0"/>
       <w:pgNumType/>
       <w:docGrid w:linePitch="360"/>
     </w:sectPr>
@@ -664,10 +736,10 @@
     <w:lvl w:ilvl="0" w15:tentative="1">
       <w:start w:val="1"/>
       <w:numFmt w:val="bullet"/>
-      <w:lvlText w:val="•"/>
+      <w:lvlText w:val="–"/>
       <w:lvlJc w:val="left"/>
       <w:pPr>
-        <w:ind w:left="360" w:hanging="215"/>
+        <w:ind w:left="316" w:hanging="230"/>
       </w:pPr>
     </w:lvl>
   </w:abstractNum>

</xml_diff>